<commit_message>
Limit catalogue exposure to demo investor
</commit_message>
<xml_diff>
--- a/docs/FundInv_Final_Presentation_Runbook.docx
+++ b/docs/FundInv_Final_Presentation_Runbook.docx
@@ -1454,7 +1454,7 @@
         <w:rPr>
           <w:rFonts w:ascii="Calibri" w:hAnsi="Calibri"/>
         </w:rPr>
-        <w:t>After the catalogue-restoration migration, the approved demonstration suite is 13 products: QQQ, VOO, VTI, SPY, BND, AGG, VYM, SCHD, SOXL, TQQQ, TLT, SCHR, and VIG. High-risk products remain clearly labelled.</w:t>
+        <w:t>After the demonstration-investor visibility migration, the approved suite is 13 products: QQQ, VOO, VTI, SPY, BND, AGG, VYM, SCHD, SOXL, TQQQ, TLT, SCHR, and VIG. High-risk products remain clearly labelled.</w:t>
       </w:r>
     </w:p>
     <w:p>
@@ -2834,7 +2834,20 @@
         <w:rPr>
           <w:rFonts w:ascii="Calibri" w:hAnsi="Calibri"/>
         </w:rPr>
-        <w:t>The deployed database had only QQQ, VOO, and SOXL, with SOXL hidden from the</w:t>
+        <w:t xml:space="preserve">The Manager's </w:t>
+      </w:r>
+      <w:r>
+        <w:rPr>
+          <w:rFonts w:ascii="Calibri" w:hAnsi="Calibri"/>
+          <w:b/>
+        </w:rPr>
+        <w:t>Your Funds (3)</w:t>
+      </w:r>
+      <w:r>
+        <w:rPr>
+          <w:rFonts w:ascii="Calibri" w:hAnsi="Calibri"/>
+        </w:rPr>
+        <w:t xml:space="preserve"> page lists only the funds owned by that</w:t>
       </w:r>
     </w:p>
     <w:p>
@@ -2842,7 +2855,26 @@
         <w:rPr>
           <w:rFonts w:ascii="Calibri" w:hAnsi="Calibri"/>
         </w:rPr>
-        <w:t>default Investor by the old high-risk targeting rule. That is why only two funds appeared.</w:t>
+        <w:t>Manager; it is not a count of every product in the database.</w:t>
+      </w:r>
+    </w:p>
+    <w:p>
+      <w:pPr>
+        <w:pStyle w:val="ListBullet"/>
+      </w:pPr>
+      <w:r>
+        <w:rPr>
+          <w:rFonts w:ascii="Calibri" w:hAnsi="Calibri"/>
+        </w:rPr>
+        <w:t>The demonstration Investor saw only two products because its visibility</w:t>
+      </w:r>
+    </w:p>
+    <w:p>
+      <w:r>
+        <w:rPr>
+          <w:rFonts w:ascii="Calibri" w:hAnsi="Calibri"/>
+        </w:rPr>
+        <w:t>targeting rows did not expose the complete catalogue.</w:t>
       </w:r>
     </w:p>
     <w:p>
@@ -2861,21 +2893,29 @@
           <w:color w:val="1F4D78"/>
           <w:sz w:val="19"/>
         </w:rPr>
-        <w:t>v0.5.4_restore_fund_catalog</w:t>
+        <w:t>v0.5.4_expose_demo_catalog</w:t>
       </w:r>
       <w:r>
         <w:rPr>
           <w:rFonts w:ascii="Calibri" w:hAnsi="Calibri"/>
         </w:rPr>
-        <w:t xml:space="preserve"> restores the 13 products and exposes</w:t>
+        <w:t xml:space="preserve"> changes only</w:t>
       </w:r>
     </w:p>
     <w:p>
       <w:r>
         <w:rPr>
+          <w:rFonts w:ascii="Consolas" w:hAnsi="Consolas"/>
+          <w:color w:val="1F4D78"/>
+          <w:sz w:val="19"/>
+        </w:rPr>
+        <w:t>investor@fundinv.com</w:t>
+      </w:r>
+      <w:r>
+        <w:rPr>
           <w:rFonts w:ascii="Calibri" w:hAnsi="Calibri"/>
         </w:rPr>
-        <w:t>them to active investors while retaining their risk labels.</w:t>
+        <w:t>: it exposes the 13 existing active, approved products while retaining their risk labels. It does not recreate, activate, approve, or modify any fund and does not affect other investors.</w:t>
       </w:r>
     </w:p>
     <w:p>

</xml_diff>

<commit_message>
Remove catalogue migration in favor of live demo setup
</commit_message>
<xml_diff>
--- a/docs/FundInv_Final_Presentation_Runbook.docx
+++ b/docs/FundInv_Final_Presentation_Runbook.docx
@@ -1454,7 +1454,7 @@
         <w:rPr>
           <w:rFonts w:ascii="Calibri" w:hAnsi="Calibri"/>
         </w:rPr>
-        <w:t>After the demonstration-investor visibility migration, the approved suite is 13 products: QQQ, VOO, VTI, SPY, BND, AGG, VYM, SCHD, SOXL, TQQQ, TLT, SCHR, and VIG. High-risk products remain clearly labelled.</w:t>
+        <w:t>The approved suite contains 13 products: QQQ, VOO, VTI, SPY, BND, AGG, VYM, SCHD, SOXL, TQQQ, TLT, SCHR, and VIG. High-risk products remain clearly labelled.</w:t>
       </w:r>
     </w:p>
     <w:p>
@@ -2866,7 +2866,7 @@
         <w:rPr>
           <w:rFonts w:ascii="Calibri" w:hAnsi="Calibri"/>
         </w:rPr>
-        <w:t>The demonstration Investor saw only two products because its visibility</w:t>
+        <w:t>Before final demonstration setup, the Investor owned only QQQ and VOO. That</w:t>
       </w:r>
     </w:p>
     <w:p>
@@ -2874,7 +2874,7 @@
         <w:rPr>
           <w:rFonts w:ascii="Calibri" w:hAnsi="Calibri"/>
         </w:rPr>
-        <w:t>targeting rows did not expose the complete catalogue.</w:t>
+        <w:t>was a holdings count, not the size of the full catalogue.</w:t>
       </w:r>
     </w:p>
     <w:p>
@@ -2885,37 +2885,15 @@
         <w:rPr>
           <w:rFonts w:ascii="Calibri" w:hAnsi="Calibri"/>
         </w:rPr>
-        <w:t xml:space="preserve">Migration </w:t>
-      </w:r>
-      <w:r>
-        <w:rPr>
-          <w:rFonts w:ascii="Consolas" w:hAnsi="Consolas"/>
-          <w:color w:val="1F4D78"/>
-          <w:sz w:val="19"/>
-        </w:rPr>
-        <w:t>v0.5.4_expose_demo_catalog</w:t>
-      </w:r>
-      <w:r>
-        <w:rPr>
-          <w:rFonts w:ascii="Calibri" w:hAnsi="Calibri"/>
-        </w:rPr>
-        <w:t xml:space="preserve"> changes only</w:t>
+        <w:t>Demonstration setup uses the normal subscription, demo PayNow, and Operations</w:t>
       </w:r>
     </w:p>
     <w:p>
       <w:r>
         <w:rPr>
-          <w:rFonts w:ascii="Consolas" w:hAnsi="Consolas"/>
-          <w:color w:val="1F4D78"/>
-          <w:sz w:val="19"/>
-        </w:rPr>
-        <w:t>investor@fundinv.com</w:t>
-      </w:r>
-      <w:r>
-        <w:rPr>
           <w:rFonts w:ascii="Calibri" w:hAnsi="Calibri"/>
         </w:rPr>
-        <w:t>: it exposes the 13 existing active, approved products while retaining their risk labels. It does not recreate, activate, approve, or modify any fund and does not affect other investors.</w:t>
+        <w:t>settlement workflow to create actual Investor fund-unit holdings.</w:t>
       </w:r>
     </w:p>
     <w:p>

</xml_diff>